<commit_message>
Add new content for 2027 Buick Enclave Avenir, including specifications, features, and dealership information
</commit_message>
<xml_diff>
--- a/NICK-MAYERS-AUTOGROUP/Nick Mayer Buick GMC of Dickson/Approved-Contents/2026-Buick-Enclave-Avenir-Dickson-REVISED (1).docx
+++ b/NICK-MAYERS-AUTOGROUP/Nick Mayer Buick GMC of Dickson/Approved-Contents/2026-Buick-Enclave-Avenir-Dickson-REVISED (1).docx
@@ -504,39 +504,15 @@
         <w:spacing w:after="160"/>
       </w:pPr>
       <w:r>
-        <w:t xml:space="preserve">Cars.com's coverage of the 2026 Enclave notes that the Avenir trim rides on 22-inch wheels with adaptive dampers, along with a color-matched lower body, a panoramic moonroof, and a unique grille (</w:t>
-      </w:r>
-      <w:hyperlink w:history="1" r:id="rIdhvnv7a0oybqzpq9dal5vn">
-        <w:r>
-          <w:rPr>
-            <w:rStyle w:val="Hyperlink"/>
-            <w:u w:val="single"/>
-          </w:rPr>
-          <w:t xml:space="preserve">Cars.com, 2026 Buick Enclave review</w:t>
-        </w:r>
-      </w:hyperlink>
-      <w:r>
-        <w:t xml:space="preserve">).</w:t>
-      </w:r>
-    </w:p>
-    <w:p>
-      <w:pPr>
-        <w:spacing w:after="160"/>
-      </w:pPr>
-      <w:r>
-        <w:t xml:space="preserve">Autoblog's review of the 2026 Enclave points to the vehicle's cabin space, the 30-inch display with Google built-in, standard Bose audio, and its driver-assistance suite as the model's core strengths, alongside a settled highway ride (</w:t>
-      </w:r>
-      <w:hyperlink w:history="1" r:id="rIdrwejzh9bpnfbovouqf8nb">
-        <w:r>
-          <w:rPr>
-            <w:rStyle w:val="Hyperlink"/>
-            <w:u w:val="single"/>
-          </w:rPr>
-          <w:t xml:space="preserve">Autoblog, 2026 Buick Enclave review</w:t>
-        </w:r>
-      </w:hyperlink>
-      <w:r>
-        <w:t xml:space="preserve">).</w:t>
+        <w:t xml:space="preserve">Cars.com's coverage of the 2026 Enclave notes that the Avenir trim rides on 22-inch wheels with adaptive dampers, along with a color-matched lower body, a panoramic moonroof, and a unique grille.</w:t>
+      </w:r>
+    </w:p>
+    <w:p>
+      <w:pPr>
+        <w:spacing w:after="160"/>
+      </w:pPr>
+      <w:r>
+        <w:t xml:space="preserve">Autoblog's review of the 2026 Enclave points to the vehicle's cabin space, the 30-inch display with Google built-in, standard Bose audio, and its driver-assistance suite as the model's core strengths, alongside a settled highway ride.</w:t>
       </w:r>
     </w:p>
     <w:p>
@@ -561,39 +537,15 @@
         <w:spacing w:after="160"/>
       </w:pPr>
       <w:r>
-        <w:t xml:space="preserve">The EPA rates the 2026 Enclave Avenir at an estimated 20 mpg city, 25 mpg highway, and 22 mpg combined with front-wheel drive, and 20 mpg city, 24 mpg highway, and 21 mpg combined with all-wheel drive (</w:t>
-      </w:r>
-      <w:hyperlink w:history="1" r:id="rIdwni8c3iqaleuznw-nni0c">
-        <w:r>
-          <w:rPr>
-            <w:rStyle w:val="Hyperlink"/>
-            <w:u w:val="single"/>
-          </w:rPr>
-          <w:t xml:space="preserve">Buick, 2026 Enclave EPA fuel economy estimates</w:t>
-        </w:r>
-      </w:hyperlink>
-      <w:r>
-        <w:t xml:space="preserve">).</w:t>
-      </w:r>
-    </w:p>
-    <w:p>
-      <w:pPr>
-        <w:spacing w:after="160"/>
-      </w:pPr>
-      <w:r>
-        <w:t xml:space="preserve">An independent road test of an all-wheel-drive Enclave Avenir reported a 28 mpg average during testing. That figure is one outlet's real-world result, not an official rating (</w:t>
-      </w:r>
-      <w:hyperlink w:history="1" r:id="rIdek68i_5wdabuogfdzq4vh">
-        <w:r>
-          <w:rPr>
-            <w:rStyle w:val="Hyperlink"/>
-            <w:u w:val="single"/>
-          </w:rPr>
-          <w:t xml:space="preserve">EV Rider, 2026 Buick Enclave Avenir AWD road test</w:t>
-        </w:r>
-      </w:hyperlink>
-      <w:r>
-        <w:t xml:space="preserve">).</w:t>
+        <w:t xml:space="preserve">The EPA rates the 2026 Enclave Avenir at an estimated 20 mpg city, 25 mpg highway, and 22 mpg combined with front-wheel drive, and 20 mpg city, 24 mpg highway, and 21 mpg combined with all-wheel drive.</w:t>
+      </w:r>
+    </w:p>
+    <w:p>
+      <w:pPr>
+        <w:spacing w:after="160"/>
+      </w:pPr>
+      <w:r>
+        <w:t xml:space="preserve">An independent road test of an all-wheel-drive Enclave Avenir reported a 28 mpg average during testing. That figure is one outlet's real-world result, not an official rating.</w:t>
       </w:r>
     </w:p>
     <w:p>
@@ -755,134 +707,6 @@
       </w:pPr>
       <w:r>
         <w:t xml:space="preserve">Nick Mayer Buick GMC of Dickson is located at 2211 Highway 46 South in Dickson, TN 37055. Drivers can call 615-639-0282 or visit in person to inquire about available Buick Enclave Avenir models and current inventory.</w:t>
-      </w:r>
-    </w:p>
-    <w:p>
-      <w:pPr>
-        <w:pStyle w:val="Heading1"/>
-        <w:spacing w:after="160" w:before="320"/>
-      </w:pPr>
-      <w:r>
-        <w:t xml:space="preserve">Sources</w:t>
-      </w:r>
-    </w:p>
-    <w:p>
-      <w:pPr>
-        <w:spacing w:after="160"/>
-      </w:pPr>
-      <w:hyperlink w:history="1" r:id="rIdtqolglf_j_pl4ravf02az">
-        <w:r>
-          <w:rPr>
-            <w:rStyle w:val="Hyperlink"/>
-            <w:u w:val="single"/>
-          </w:rPr>
-          <w:t xml:space="preserve">Buick, 2026 Enclave model page</w:t>
-        </w:r>
-      </w:hyperlink>
-      <w:r>
-        <w:t xml:space="preserve">: engine, transmission, drivetrain, seating, towing, and technology specs.</w:t>
-      </w:r>
-    </w:p>
-    <w:p>
-      <w:pPr>
-        <w:spacing w:after="160"/>
-      </w:pPr>
-      <w:hyperlink w:history="1" r:id="rId63o4zkuhjpk-fo4wbrng1">
-        <w:r>
-          <w:rPr>
-            <w:rStyle w:val="Hyperlink"/>
-            <w:u w:val="single"/>
-          </w:rPr>
-          <w:t xml:space="preserve">Buick, 2026 Enclave Avenir page</w:t>
-        </w:r>
-      </w:hyperlink>
-      <w:r>
-        <w:t xml:space="preserve">: Avenir-specific equipment, including AutoSense power liftgate, HD Surround Vision, Bose Performance audio, and massaging front seats.</w:t>
-      </w:r>
-    </w:p>
-    <w:p>
-      <w:pPr>
-        <w:spacing w:after="160"/>
-      </w:pPr>
-      <w:hyperlink w:history="1" r:id="rIdwkd3b5tqeduhx6poyxm8z">
-        <w:r>
-          <w:rPr>
-            <w:rStyle w:val="Hyperlink"/>
-            <w:u w:val="single"/>
-          </w:rPr>
-          <w:t xml:space="preserve">Buick pressroom, 2026 Enclave EPA fuel economy estimates</w:t>
-        </w:r>
-      </w:hyperlink>
-      <w:r>
-        <w:t xml:space="preserve">: official FWD/AWD mpg figures.</w:t>
-      </w:r>
-    </w:p>
-    <w:p>
-      <w:pPr>
-        <w:spacing w:after="160"/>
-      </w:pPr>
-      <w:hyperlink w:history="1" r:id="rIdgijbsvnwdxk4st2cekdsx">
-        <w:r>
-          <w:rPr>
-            <w:rStyle w:val="Hyperlink"/>
-            <w:u w:val="single"/>
-          </w:rPr>
-          <w:t xml:space="preserve">GM Authority, Here's How Much The 2026 Buick Enclave Can Tow</w:t>
-        </w:r>
-      </w:hyperlink>
-      <w:r>
-        <w:t xml:space="preserve">: confirms 5,000-lb rating applies to FWD and AWD with the standard Trailering Package.</w:t>
-      </w:r>
-    </w:p>
-    <w:p>
-      <w:pPr>
-        <w:spacing w:after="160"/>
-      </w:pPr>
-      <w:hyperlink w:history="1" r:id="rIdrmrpp_kon0uxoatrksfsk">
-        <w:r>
-          <w:rPr>
-            <w:rStyle w:val="Hyperlink"/>
-            <w:u w:val="single"/>
-          </w:rPr>
-          <w:t xml:space="preserve">Cars.com, 2026 Buick Enclave review</w:t>
-        </w:r>
-      </w:hyperlink>
-      <w:r>
-        <w:t xml:space="preserve">: Avenir wheel and suspension detail; independent EPA cross-check.</w:t>
-      </w:r>
-    </w:p>
-    <w:p>
-      <w:pPr>
-        <w:spacing w:after="160"/>
-      </w:pPr>
-      <w:hyperlink w:history="1" r:id="rIdvdafab7iximzn1acdlggz">
-        <w:r>
-          <w:rPr>
-            <w:rStyle w:val="Hyperlink"/>
-            <w:u w:val="single"/>
-          </w:rPr>
-          <w:t xml:space="preserve">Autoblog, 2026 Buick Enclave review</w:t>
-        </w:r>
-      </w:hyperlink>
-      <w:r>
-        <w:t xml:space="preserve">: independent editorial assessment.</w:t>
-      </w:r>
-    </w:p>
-    <w:p>
-      <w:pPr>
-        <w:spacing w:after="160"/>
-      </w:pPr>
-      <w:hyperlink w:history="1" r:id="rIdrbcshqyzpacj8su2gxfik">
-        <w:r>
-          <w:rPr>
-            <w:rStyle w:val="Hyperlink"/>
-            <w:u w:val="single"/>
-          </w:rPr>
-          <w:t xml:space="preserve">EV Rider, 2026 Buick Enclave Avenir AWD road test</w:t>
-        </w:r>
-      </w:hyperlink>
-      <w:r>
-        <w:t xml:space="preserve">: independent real-world fuel economy test.</w:t>
       </w:r>
     </w:p>
     <w:sectPr>

</xml_diff>